<commit_message>
upd arco3 en, es e fr
</commit_message>
<xml_diff>
--- a/DOCS_DA_CONVERTIRE/arco3_fornasari_en.docx
+++ b/DOCS_DA_CONVERTIRE/arco3_fornasari_en.docx
@@ -2,14 +2,6 @@
 <file path=word/document.xml><?xml version="1.0" encoding="utf-8"?>
 <w:document xmlns:wpc="http://schemas.microsoft.com/office/word/2010/wordprocessingCanvas" xmlns:cx="http://schemas.microsoft.com/office/drawing/2014/chartex" xmlns:cx1="http://schemas.microsoft.com/office/drawing/2015/9/8/chartex" xmlns:cx2="http://schemas.microsoft.com/office/drawing/2015/10/21/chartex" xmlns:cx3="http://schemas.microsoft.com/office/drawing/2016/5/9/chartex" xmlns:cx4="http://schemas.microsoft.com/office/drawing/2016/5/10/chartex" xmlns:cx5="http://schemas.microsoft.com/office/drawing/2016/5/11/chartex" xmlns:cx6="http://schemas.microsoft.com/office/drawing/2016/5/12/chartex" xmlns:cx7="http://schemas.microsoft.com/office/drawing/2016/5/13/chartex" xmlns:cx8="http://schemas.microsoft.com/office/drawing/2016/5/14/chartex" xmlns:mc="http://schemas.openxmlformats.org/markup-compatibility/2006" xmlns:aink="http://schemas.microsoft.com/office/drawing/2016/ink" xmlns:am3d="http://schemas.microsoft.com/office/drawing/2017/model3d" xmlns:o="urn:schemas-microsoft-com:office:office" xmlns:oel="http://schemas.microsoft.com/office/2019/extlst" xmlns:r="http://schemas.openxmlformats.org/officeDocument/2006/relationships" xmlns:m="http://schemas.openxmlformats.org/officeDocument/2006/math" xmlns:v="urn:schemas-microsoft-com:vml" xmlns:wp14="http://schemas.microsoft.com/office/word/2010/wordprocessingDrawing" xmlns:wp="http://schemas.openxmlformats.org/drawingml/2006/wordprocessingDrawing" xmlns:w10="urn:schemas-microsoft-com:office:word" xmlns:w="http://schemas.openxmlformats.org/wordprocessingml/2006/main" xmlns:w14="http://schemas.microsoft.com/office/word/2010/wordml" xmlns:w15="http://schemas.microsoft.com/office/word/2012/wordml" xmlns:w16cex="http://schemas.microsoft.com/office/word/2018/wordml/cex" xmlns:w16cid="http://schemas.microsoft.com/office/word/2016/wordml/cid" xmlns:w16="http://schemas.microsoft.com/office/word/2018/wordml" xmlns:w16du="http://schemas.microsoft.com/office/word/2023/wordml/word16du" xmlns:w16sdtdh="http://schemas.microsoft.com/office/word/2020/wordml/sdtdatahash" xmlns:w16sdtfl="http://schemas.microsoft.com/office/word/2024/wordml/sdtformatlock" xmlns:w16se="http://schemas.microsoft.com/office/word/2015/wordml/symex" xmlns:wpg="http://schemas.microsoft.com/office/word/2010/wordprocessingGroup" xmlns:wpi="http://schemas.microsoft.com/office/word/2010/wordprocessingInk" xmlns:wne="http://schemas.microsoft.com/office/word/2006/wordml" xmlns:wps="http://schemas.microsoft.com/office/word/2010/wordprocessingShape" mc:Ignorable="w14 w15 w16se w16cid w16 w16cex w16sdtdh w16sdtfl w16du wp14">
   <w:body>
-    <w:p>
-      <w:pPr>
-        <w:pStyle w:val="Titolo1"/>
-      </w:pPr>
-      <w:r>
-        <w:t>Arch 3 Memorial Tablet of Abbot Ippolito Fornasari</w:t>
-      </w:r>
-    </w:p>
     <w:p>
       <w:pPr>
         <w:pBdr>
@@ -257,6 +249,9 @@
         <w:jc w:val="center"/>
       </w:pPr>
       <w:r>
+        <w:rPr>
+          <w:noProof/>
+        </w:rPr>
         <w:drawing>
           <wp:inline distT="0" distB="0" distL="0" distR="0" wp14:anchorId="6A6A90A0" wp14:editId="153B4B14">
             <wp:extent cx="3665220" cy="2255520"/>
@@ -313,7 +308,15 @@
         <w:jc w:val="center"/>
       </w:pPr>
       <w:r>
-        <w:t>[SPLIT_BLOCK:arco3_lapide.jpg]</w:t>
+        <w:t>[SPLIT_</w:t>
+      </w:r>
+      <w:proofErr w:type="gramStart"/>
+      <w:r>
+        <w:t>BLOCK:arco3_lapide.jpg</w:t>
+      </w:r>
+      <w:proofErr w:type="gramEnd"/>
+      <w:r>
+        <w:t>]</w:t>
       </w:r>
     </w:p>
     <w:p>
@@ -560,7 +563,15 @@
       </w:r>
       <w:proofErr w:type="spellEnd"/>
       <w:r>
-        <w:t xml:space="preserve"> in a </w:t>
+        <w:t xml:space="preserve"> </w:t>
+      </w:r>
+      <w:proofErr w:type="gramStart"/>
+      <w:r>
+        <w:t>in a</w:t>
+      </w:r>
+      <w:proofErr w:type="gramEnd"/>
+      <w:r>
+        <w:t xml:space="preserve"> </w:t>
       </w:r>
       <w:proofErr w:type="spellStart"/>
       <w:r>
@@ -1049,11 +1060,7 @@
       </w:r>
       <w:proofErr w:type="spellEnd"/>
       <w:r>
-        <w:t xml:space="preserve"> for Abbas (Abbot). Bon. </w:t>
-      </w:r>
-      <w:r>
-        <w:lastRenderedPageBreak/>
-        <w:t>(</w:t>
+        <w:t xml:space="preserve"> for Abbas (Abbot). Bon. (</w:t>
       </w:r>
       <w:proofErr w:type="spellStart"/>
       <w:r>
@@ -1142,7 +1149,15 @@
         <w:t>4. EN PATR. ARCHIGYM. IC DE MANE PRIM. EMER. D.</w:t>
       </w:r>
       <w:r>
-        <w:t xml:space="preserve">: "Behold, the Patrician, </w:t>
+        <w:t>: "</w:t>
+      </w:r>
+      <w:proofErr w:type="spellStart"/>
+      <w:r>
+        <w:t>Behold</w:t>
+      </w:r>
+      <w:proofErr w:type="spellEnd"/>
+      <w:r>
+        <w:t xml:space="preserve">, the Patrician, </w:t>
       </w:r>
       <w:proofErr w:type="spellStart"/>
       <w:r>
@@ -1282,6 +1297,7 @@
         </w:pBdr>
       </w:pPr>
       <w:r>
+        <w:lastRenderedPageBreak/>
         <w:t>ARCHIGYM. (</w:t>
       </w:r>
       <w:proofErr w:type="spellStart"/>
@@ -1538,7 +1554,15 @@
         </w:pBdr>
       </w:pPr>
       <w:r>
-        <w:t>D. (Dedit / Dicavit): "Gave" or "</w:t>
+        <w:t xml:space="preserve">D. (Dedit / </w:t>
+      </w:r>
+      <w:proofErr w:type="spellStart"/>
+      <w:r>
+        <w:t>Dicavit</w:t>
+      </w:r>
+      <w:proofErr w:type="spellEnd"/>
+      <w:r>
+        <w:t>): "Gave" or "</w:t>
       </w:r>
       <w:proofErr w:type="spellStart"/>
       <w:r>
@@ -2740,16 +2764,8 @@
         <w:rPr>
           <w:rFonts w:ascii="Courier" w:eastAsia="Courier" w:hAnsi="Courier" w:cs="Courier"/>
         </w:rPr>
-        <w:t xml:space="preserve"> Felsina </w:t>
-      </w:r>
-      <w:proofErr w:type="spellStart"/>
-      <w:r>
-        <w:rPr>
-          <w:rFonts w:ascii="Courier" w:eastAsia="Courier" w:hAnsi="Courier" w:cs="Courier"/>
-        </w:rPr>
-        <w:t>Porticibus</w:t>
-      </w:r>
-      <w:proofErr w:type="spellEnd"/>
+        <w:t xml:space="preserve"> Felsina Porticibus</w:t>
+      </w:r>
       <w:r>
         <w:rPr>
           <w:rFonts w:ascii="Courier" w:eastAsia="Courier" w:hAnsi="Courier" w:cs="Courier"/>
@@ -3131,7 +3147,6 @@
         <w:spacing w:before="0"/>
       </w:pPr>
       <w:r>
-        <w:lastRenderedPageBreak/>
         <w:t xml:space="preserve">Free </w:t>
       </w:r>
       <w:proofErr w:type="spellStart"/>
@@ -3219,6 +3234,7 @@
         </w:pBdr>
       </w:pPr>
       <w:r>
+        <w:lastRenderedPageBreak/>
         <w:t xml:space="preserve">The Virgin, Golden House of Heaven, </w:t>
       </w:r>
       <w:proofErr w:type="spellStart"/>
@@ -3691,23 +3707,7 @@
           <w:b/>
           <w:bCs/>
         </w:rPr>
-        <w:t xml:space="preserve"> Felsina </w:t>
-      </w:r>
-      <w:proofErr w:type="spellStart"/>
-      <w:r>
-        <w:rPr>
-          <w:b/>
-          <w:bCs/>
-        </w:rPr>
-        <w:t>Porticibus</w:t>
-      </w:r>
-      <w:proofErr w:type="spellEnd"/>
-      <w:r>
-        <w:rPr>
-          <w:b/>
-          <w:bCs/>
-        </w:rPr>
-        <w:t>:</w:t>
+        <w:t xml:space="preserve"> Felsina Porticibus:</w:t>
       </w:r>
       <w:r>
         <w:t xml:space="preserve"> </w:t>
@@ -4240,7 +4240,15 @@
       </w:r>
       <w:proofErr w:type="spellEnd"/>
       <w:r>
-        <w:t xml:space="preserve"> in a </w:t>
+        <w:t xml:space="preserve"> </w:t>
+      </w:r>
+      <w:proofErr w:type="gramStart"/>
+      <w:r>
+        <w:t>in a</w:t>
+      </w:r>
+      <w:proofErr w:type="gramEnd"/>
+      <w:r>
+        <w:t xml:space="preserve"> </w:t>
       </w:r>
       <w:proofErr w:type="spellStart"/>
       <w:r>
@@ -5066,21 +5074,7 @@
         <w:rPr>
           <w:rFonts w:ascii="Arial Unicode MS" w:eastAsia="Arial Unicode MS" w:hAnsi="Arial Unicode MS" w:cs="Arial Unicode MS"/>
         </w:rPr>
-        <w:t xml:space="preserve"> Felsina </w:t>
-      </w:r>
-      <w:proofErr w:type="spellStart"/>
-      <w:r>
-        <w:rPr>
-          <w:rFonts w:ascii="Arial Unicode MS" w:eastAsia="Arial Unicode MS" w:hAnsi="Arial Unicode MS" w:cs="Arial Unicode MS"/>
-        </w:rPr>
-        <w:t>Porticibus</w:t>
-      </w:r>
-      <w:proofErr w:type="spellEnd"/>
-      <w:r>
-        <w:rPr>
-          <w:rFonts w:ascii="Arial Unicode MS" w:eastAsia="Arial Unicode MS" w:hAnsi="Arial Unicode MS" w:cs="Arial Unicode MS"/>
-        </w:rPr>
-        <w:t xml:space="preserve">": In 1693, writing </w:t>
+        <w:t xml:space="preserve"> Felsina Porticibus": In 1693, writing </w:t>
       </w:r>
       <w:proofErr w:type="spellStart"/>
       <w:r>
@@ -5556,192 +5550,195 @@
         <w:spacing w:after="240"/>
       </w:pPr>
       <w:r>
+        <w:t xml:space="preserve">The </w:t>
+      </w:r>
+      <w:proofErr w:type="spellStart"/>
+      <w:r>
+        <w:t>inscription</w:t>
+      </w:r>
+      <w:proofErr w:type="spellEnd"/>
+      <w:r>
+        <w:t xml:space="preserve"> </w:t>
+      </w:r>
+      <w:proofErr w:type="spellStart"/>
+      <w:r>
+        <w:t>found</w:t>
+      </w:r>
+      <w:proofErr w:type="spellEnd"/>
+      <w:r>
+        <w:t xml:space="preserve"> </w:t>
+      </w:r>
+      <w:proofErr w:type="spellStart"/>
+      <w:r>
+        <w:t>is</w:t>
+      </w:r>
+      <w:proofErr w:type="spellEnd"/>
+      <w:r>
+        <w:t xml:space="preserve"> one of the </w:t>
+      </w:r>
+      <w:proofErr w:type="spellStart"/>
+      <w:r>
+        <w:t>richest</w:t>
+      </w:r>
+      <w:proofErr w:type="spellEnd"/>
+      <w:r>
+        <w:t xml:space="preserve"> and </w:t>
+      </w:r>
+      <w:proofErr w:type="spellStart"/>
+      <w:r>
+        <w:t>most</w:t>
+      </w:r>
+      <w:proofErr w:type="spellEnd"/>
+      <w:r>
+        <w:t xml:space="preserve"> </w:t>
+      </w:r>
+      <w:proofErr w:type="spellStart"/>
+      <w:r>
+        <w:t>literary</w:t>
+      </w:r>
+      <w:proofErr w:type="spellEnd"/>
+      <w:r>
+        <w:t xml:space="preserve"> of the </w:t>
+      </w:r>
+      <w:proofErr w:type="spellStart"/>
+      <w:r>
+        <w:t>entire</w:t>
+      </w:r>
+      <w:proofErr w:type="spellEnd"/>
+      <w:r>
+        <w:t xml:space="preserve"> </w:t>
+      </w:r>
+      <w:proofErr w:type="spellStart"/>
+      <w:r>
+        <w:t>path</w:t>
+      </w:r>
+      <w:proofErr w:type="spellEnd"/>
+      <w:r>
+        <w:t xml:space="preserve">. </w:t>
+      </w:r>
+      <w:proofErr w:type="spellStart"/>
+      <w:r>
+        <w:t>Often</w:t>
+      </w:r>
+      <w:proofErr w:type="spellEnd"/>
+      <w:r>
+        <w:t xml:space="preserve"> the tablets of the </w:t>
+      </w:r>
+      <w:proofErr w:type="spellStart"/>
+      <w:r>
+        <w:t>subsequent</w:t>
+      </w:r>
+      <w:proofErr w:type="spellEnd"/>
+      <w:r>
+        <w:t xml:space="preserve"> </w:t>
+      </w:r>
+      <w:proofErr w:type="spellStart"/>
+      <w:r>
+        <w:t>arches</w:t>
+      </w:r>
+      <w:proofErr w:type="spellEnd"/>
+      <w:r>
+        <w:t xml:space="preserve"> are </w:t>
+      </w:r>
+      <w:proofErr w:type="spellStart"/>
+      <w:r>
+        <w:t>much</w:t>
+      </w:r>
+      <w:proofErr w:type="spellEnd"/>
+      <w:r>
+        <w:t xml:space="preserve"> more </w:t>
+      </w:r>
+      <w:proofErr w:type="spellStart"/>
+      <w:r>
+        <w:t>synthetic</w:t>
+      </w:r>
+      <w:proofErr w:type="spellEnd"/>
+      <w:r>
+        <w:t xml:space="preserve"> (</w:t>
+      </w:r>
+      <w:proofErr w:type="spellStart"/>
+      <w:r>
+        <w:t>only</w:t>
+      </w:r>
+      <w:proofErr w:type="spellEnd"/>
+      <w:r>
+        <w:t xml:space="preserve"> name and date). The </w:t>
+      </w:r>
+      <w:proofErr w:type="spellStart"/>
+      <w:r>
+        <w:t>fact</w:t>
+      </w:r>
+      <w:proofErr w:type="spellEnd"/>
+      <w:r>
+        <w:t xml:space="preserve"> </w:t>
+      </w:r>
+      <w:proofErr w:type="spellStart"/>
+      <w:r>
+        <w:t>that</w:t>
+      </w:r>
+      <w:proofErr w:type="spellEnd"/>
+      <w:r>
+        <w:t xml:space="preserve"> </w:t>
+      </w:r>
+      <w:proofErr w:type="spellStart"/>
+      <w:r>
+        <w:t>this</w:t>
+      </w:r>
+      <w:proofErr w:type="spellEnd"/>
+      <w:r>
+        <w:t xml:space="preserve"> one </w:t>
+      </w:r>
+      <w:proofErr w:type="spellStart"/>
+      <w:r>
+        <w:t>is</w:t>
+      </w:r>
+      <w:proofErr w:type="spellEnd"/>
+      <w:r>
+        <w:t xml:space="preserve"> so elaborate </w:t>
+      </w:r>
+      <w:proofErr w:type="spellStart"/>
+      <w:r>
+        <w:t>confirms</w:t>
+      </w:r>
+      <w:proofErr w:type="spellEnd"/>
+      <w:r>
+        <w:t xml:space="preserve"> the high </w:t>
+      </w:r>
+      <w:proofErr w:type="spellStart"/>
+      <w:r>
+        <w:t>rank</w:t>
+      </w:r>
+      <w:proofErr w:type="spellEnd"/>
+      <w:r>
+        <w:t xml:space="preserve"> of Ippolito Fornasari: </w:t>
+      </w:r>
+      <w:proofErr w:type="spellStart"/>
+      <w:r>
+        <w:t>as</w:t>
+      </w:r>
+      <w:proofErr w:type="spellEnd"/>
+      <w:r>
+        <w:t xml:space="preserve"> "Morning </w:t>
+      </w:r>
+      <w:proofErr w:type="spellStart"/>
+      <w:r>
+        <w:t>Primary</w:t>
+      </w:r>
+      <w:proofErr w:type="spellEnd"/>
+      <w:r>
+        <w:t xml:space="preserve">" </w:t>
+      </w:r>
+      <w:proofErr w:type="spellStart"/>
+      <w:r>
+        <w:t>at</w:t>
+      </w:r>
+      <w:proofErr w:type="spellEnd"/>
+      <w:r>
+        <w:t xml:space="preserve"> the </w:t>
+      </w:r>
+      <w:r>
         <w:lastRenderedPageBreak/>
-        <w:t xml:space="preserve">The </w:t>
-      </w:r>
-      <w:proofErr w:type="spellStart"/>
-      <w:r>
-        <w:t>inscription</w:t>
-      </w:r>
-      <w:proofErr w:type="spellEnd"/>
-      <w:r>
-        <w:t xml:space="preserve"> </w:t>
-      </w:r>
-      <w:proofErr w:type="spellStart"/>
-      <w:r>
-        <w:t>found</w:t>
-      </w:r>
-      <w:proofErr w:type="spellEnd"/>
-      <w:r>
-        <w:t xml:space="preserve"> </w:t>
-      </w:r>
-      <w:proofErr w:type="spellStart"/>
-      <w:r>
-        <w:t>is</w:t>
-      </w:r>
-      <w:proofErr w:type="spellEnd"/>
-      <w:r>
-        <w:t xml:space="preserve"> one of the </w:t>
-      </w:r>
-      <w:proofErr w:type="spellStart"/>
-      <w:r>
-        <w:t>richest</w:t>
-      </w:r>
-      <w:proofErr w:type="spellEnd"/>
-      <w:r>
-        <w:t xml:space="preserve"> and </w:t>
-      </w:r>
-      <w:proofErr w:type="spellStart"/>
-      <w:r>
-        <w:t>most</w:t>
-      </w:r>
-      <w:proofErr w:type="spellEnd"/>
-      <w:r>
-        <w:t xml:space="preserve"> </w:t>
-      </w:r>
-      <w:proofErr w:type="spellStart"/>
-      <w:r>
-        <w:t>literary</w:t>
-      </w:r>
-      <w:proofErr w:type="spellEnd"/>
-      <w:r>
-        <w:t xml:space="preserve"> of the </w:t>
-      </w:r>
-      <w:proofErr w:type="spellStart"/>
-      <w:r>
-        <w:t>entire</w:t>
-      </w:r>
-      <w:proofErr w:type="spellEnd"/>
-      <w:r>
-        <w:t xml:space="preserve"> </w:t>
-      </w:r>
-      <w:proofErr w:type="spellStart"/>
-      <w:r>
-        <w:t>path</w:t>
-      </w:r>
-      <w:proofErr w:type="spellEnd"/>
-      <w:r>
-        <w:t xml:space="preserve">. </w:t>
-      </w:r>
-      <w:proofErr w:type="spellStart"/>
-      <w:r>
-        <w:t>Often</w:t>
-      </w:r>
-      <w:proofErr w:type="spellEnd"/>
-      <w:r>
-        <w:t xml:space="preserve"> the tablets of the </w:t>
-      </w:r>
-      <w:proofErr w:type="spellStart"/>
-      <w:r>
-        <w:t>subsequent</w:t>
-      </w:r>
-      <w:proofErr w:type="spellEnd"/>
-      <w:r>
-        <w:t xml:space="preserve"> </w:t>
-      </w:r>
-      <w:proofErr w:type="spellStart"/>
-      <w:r>
-        <w:t>arches</w:t>
-      </w:r>
-      <w:proofErr w:type="spellEnd"/>
-      <w:r>
-        <w:t xml:space="preserve"> are </w:t>
-      </w:r>
-      <w:proofErr w:type="spellStart"/>
-      <w:r>
-        <w:t>much</w:t>
-      </w:r>
-      <w:proofErr w:type="spellEnd"/>
-      <w:r>
-        <w:t xml:space="preserve"> more </w:t>
-      </w:r>
-      <w:proofErr w:type="spellStart"/>
-      <w:r>
-        <w:t>synthetic</w:t>
-      </w:r>
-      <w:proofErr w:type="spellEnd"/>
-      <w:r>
-        <w:t xml:space="preserve"> (</w:t>
-      </w:r>
-      <w:proofErr w:type="spellStart"/>
-      <w:r>
-        <w:t>only</w:t>
-      </w:r>
-      <w:proofErr w:type="spellEnd"/>
-      <w:r>
-        <w:t xml:space="preserve"> name and date). The </w:t>
-      </w:r>
-      <w:proofErr w:type="spellStart"/>
-      <w:r>
-        <w:t>fact</w:t>
-      </w:r>
-      <w:proofErr w:type="spellEnd"/>
-      <w:r>
-        <w:t xml:space="preserve"> </w:t>
-      </w:r>
-      <w:proofErr w:type="spellStart"/>
-      <w:r>
-        <w:t>that</w:t>
-      </w:r>
-      <w:proofErr w:type="spellEnd"/>
-      <w:r>
-        <w:t xml:space="preserve"> </w:t>
-      </w:r>
-      <w:proofErr w:type="spellStart"/>
-      <w:r>
-        <w:t>this</w:t>
-      </w:r>
-      <w:proofErr w:type="spellEnd"/>
-      <w:r>
-        <w:t xml:space="preserve"> one </w:t>
-      </w:r>
-      <w:proofErr w:type="spellStart"/>
-      <w:r>
-        <w:t>is</w:t>
-      </w:r>
-      <w:proofErr w:type="spellEnd"/>
-      <w:r>
-        <w:t xml:space="preserve"> so elaborate </w:t>
-      </w:r>
-      <w:proofErr w:type="spellStart"/>
-      <w:r>
-        <w:t>confirms</w:t>
-      </w:r>
-      <w:proofErr w:type="spellEnd"/>
-      <w:r>
-        <w:t xml:space="preserve"> the high </w:t>
-      </w:r>
-      <w:proofErr w:type="spellStart"/>
-      <w:r>
-        <w:t>rank</w:t>
-      </w:r>
-      <w:proofErr w:type="spellEnd"/>
-      <w:r>
-        <w:t xml:space="preserve"> of Ippolito Fornasari: </w:t>
-      </w:r>
-      <w:proofErr w:type="spellStart"/>
-      <w:r>
-        <w:t>as</w:t>
-      </w:r>
-      <w:proofErr w:type="spellEnd"/>
-      <w:r>
-        <w:t xml:space="preserve"> "Morning </w:t>
-      </w:r>
-      <w:proofErr w:type="spellStart"/>
-      <w:r>
-        <w:t>Primary</w:t>
-      </w:r>
-      <w:proofErr w:type="spellEnd"/>
-      <w:r>
-        <w:t xml:space="preserve">" </w:t>
-      </w:r>
-      <w:proofErr w:type="spellStart"/>
-      <w:r>
-        <w:t>at</w:t>
-      </w:r>
-      <w:proofErr w:type="spellEnd"/>
-      <w:r>
-        <w:t xml:space="preserve"> the Archiginnasio, he </w:t>
+        <w:t xml:space="preserve">Archiginnasio, he </w:t>
       </w:r>
       <w:proofErr w:type="spellStart"/>
       <w:r>
@@ -6944,7 +6941,15 @@
       </w:r>
       <w:proofErr w:type="spellEnd"/>
       <w:r>
-        <w:t xml:space="preserve"> name Latinized </w:t>
+        <w:t xml:space="preserve"> name </w:t>
+      </w:r>
+      <w:proofErr w:type="spellStart"/>
+      <w:r>
+        <w:t>Latinized</w:t>
+      </w:r>
+      <w:proofErr w:type="spellEnd"/>
+      <w:r>
+        <w:t xml:space="preserve"> </w:t>
       </w:r>
       <w:proofErr w:type="spellStart"/>
       <w:r>
@@ -6983,7 +6988,6 @@
     <w:p>
       <w:r>
         <w:rPr>
-          <w:rFonts w:ascii="Arial" w:hAnsi="Arial"/>
           <w:b/>
           <w:color w:val="1A365D"/>
           <w:sz w:val="26"/>
@@ -6993,24 +6997,26 @@
     </w:p>
     <w:tbl>
       <w:tblPr>
-        <w:tblW w:type="auto" w:w="0"/>
+        <w:tblW w:w="0" w:type="auto"/>
         <w:jc w:val="center"/>
-        <w:tblLook w:firstColumn="1" w:firstRow="1" w:lastColumn="0" w:lastRow="0" w:noHBand="0" w:noVBand="1" w:val="04A0"/>
+        <w:tblLook w:val="04A0" w:firstRow="1" w:lastRow="0" w:firstColumn="1" w:lastColumn="0" w:noHBand="0" w:noVBand="1"/>
       </w:tblPr>
       <w:tblGrid>
         <w:gridCol w:w="4680"/>
         <w:gridCol w:w="4680"/>
       </w:tblGrid>
       <w:tr>
+        <w:trPr>
+          <w:jc w:val="center"/>
+        </w:trPr>
         <w:tc>
           <w:tcPr>
-            <w:tcW w:type="dxa" w:w="4680"/>
-            <w:shd w:fill="1A365D"/>
+            <w:tcW w:w="4680" w:type="dxa"/>
+            <w:shd w:val="clear" w:color="auto" w:fill="1A365D"/>
           </w:tcPr>
           <w:p>
             <w:r>
               <w:rPr>
-                <w:rFonts w:ascii="Arial" w:hAnsi="Arial"/>
                 <w:b/>
                 <w:color w:val="FFFFFF"/>
                 <w:sz w:val="20"/>
@@ -7021,13 +7027,12 @@
         </w:tc>
         <w:tc>
           <w:tcPr>
-            <w:tcW w:type="dxa" w:w="4680"/>
-            <w:shd w:fill="1A365D"/>
+            <w:tcW w:w="4680" w:type="dxa"/>
+            <w:shd w:val="clear" w:color="auto" w:fill="1A365D"/>
           </w:tcPr>
           <w:p>
             <w:r>
               <w:rPr>
-                <w:rFonts w:ascii="Arial" w:hAnsi="Arial"/>
                 <w:b/>
                 <w:color w:val="FFFFFF"/>
                 <w:sz w:val="20"/>
@@ -7038,14 +7043,16 @@
         </w:tc>
       </w:tr>
       <w:tr>
+        <w:trPr>
+          <w:jc w:val="center"/>
+        </w:trPr>
         <w:tc>
           <w:tcPr>
-            <w:tcW w:type="dxa" w:w="4680"/>
+            <w:tcW w:w="4680" w:type="dxa"/>
           </w:tcPr>
           <w:p>
             <w:r>
               <w:rPr>
-                <w:rFonts w:ascii="Arial" w:hAnsi="Arial"/>
                 <w:sz w:val="19"/>
               </w:rPr>
               <w:t>Count Gioseffo Carpegna funded the construction of Arch 3 of the Portico di San Luca and held the position of Vice-Legate of Bologna in 1693.</w:t>
@@ -7054,12 +7061,11 @@
         </w:tc>
         <w:tc>
           <w:tcPr>
-            <w:tcW w:type="dxa" w:w="4680"/>
+            <w:tcW w:w="4680" w:type="dxa"/>
           </w:tcPr>
           <w:p>
             <w:r>
               <w:rPr>
-                <w:rFonts w:ascii="Arial" w:hAnsi="Arial"/>
                 <w:sz w:val="19"/>
               </w:rPr>
               <w:t>State Archives of Bologna / 17th-Century City Chronicles</w:t>
@@ -7068,14 +7074,16 @@
         </w:tc>
       </w:tr>
       <w:tr>
+        <w:trPr>
+          <w:jc w:val="center"/>
+        </w:trPr>
         <w:tc>
           <w:tcPr>
-            <w:tcW w:type="dxa" w:w="4680"/>
+            <w:tcW w:w="4680" w:type="dxa"/>
           </w:tcPr>
           <w:p>
             <w:r>
               <w:rPr>
-                <w:rFonts w:ascii="Arial" w:hAnsi="Arial"/>
                 <w:sz w:val="19"/>
               </w:rPr>
               <w:t>The Latin inscription on Arch 3 attests to the solemn dedication to Christ and the Virgin Mary by Abbot Ippolito Fornasari, dated 1693.</w:t>
@@ -7084,12 +7092,11 @@
         </w:tc>
         <w:tc>
           <w:tcPr>
-            <w:tcW w:type="dxa" w:w="4680"/>
+            <w:tcW w:w="4680" w:type="dxa"/>
           </w:tcPr>
           <w:p>
             <w:r>
               <w:rPr>
-                <w:rFonts w:ascii="Arial" w:hAnsi="Arial"/>
                 <w:sz w:val="19"/>
               </w:rPr>
               <w:t>Epigraphy of the Portico di San Luca (Arch 3) / Civic Museum of the Risorgimento</w:t>
@@ -7098,58 +7105,76 @@
         </w:tc>
       </w:tr>
       <w:tr>
+        <w:trPr>
+          <w:jc w:val="center"/>
+        </w:trPr>
         <w:tc>
           <w:tcPr>
-            <w:tcW w:type="dxa" w:w="4680"/>
+            <w:tcW w:w="4680" w:type="dxa"/>
           </w:tcPr>
           <w:p>
             <w:r>
               <w:rPr>
-                <w:rFonts w:ascii="Arial" w:hAnsi="Arial"/>
                 <w:sz w:val="19"/>
               </w:rPr>
-              <w:t>Ippolito Fornasari was a Bolognese patrician, jurisconsult, and professor emeritus holding the morning primary chair ("De Mane Primarius") at the Archiginnasio of Bologna.</w:t>
+              <w:t xml:space="preserve">Ippolito Fornasari was a Bolognese patrician, </w:t>
+            </w:r>
+            <w:r>
+              <w:rPr>
+                <w:sz w:val="19"/>
+              </w:rPr>
+              <w:lastRenderedPageBreak/>
+              <w:t>jurisconsult, and professor emeritus holding the morning primary chair ("De Mane Primarius") at the Archiginnasio of Bologna.</w:t>
             </w:r>
           </w:p>
         </w:tc>
         <w:tc>
           <w:tcPr>
-            <w:tcW w:type="dxa" w:w="4680"/>
+            <w:tcW w:w="4680" w:type="dxa"/>
           </w:tcPr>
           <w:p>
             <w:r>
               <w:rPr>
-                <w:rFonts w:ascii="Arial" w:hAnsi="Arial"/>
                 <w:sz w:val="19"/>
               </w:rPr>
-              <w:t>Fasti of the Studio Bolognese / Historical Archives of the University of Bologna</w:t>
+              <w:lastRenderedPageBreak/>
+              <w:t xml:space="preserve">Fasti of the Studio Bolognese / Historical Archives of </w:t>
+            </w:r>
+            <w:r>
+              <w:rPr>
+                <w:sz w:val="19"/>
+              </w:rPr>
+              <w:lastRenderedPageBreak/>
+              <w:t>the University of Bologna</w:t>
             </w:r>
           </w:p>
         </w:tc>
       </w:tr>
       <w:tr>
+        <w:trPr>
+          <w:jc w:val="center"/>
+        </w:trPr>
         <w:tc>
           <w:tcPr>
-            <w:tcW w:type="dxa" w:w="4680"/>
+            <w:tcW w:w="4680" w:type="dxa"/>
           </w:tcPr>
           <w:p>
             <w:r>
               <w:rPr>
-                <w:rFonts w:ascii="Arial" w:hAnsi="Arial"/>
                 <w:sz w:val="19"/>
               </w:rPr>
+              <w:lastRenderedPageBreak/>
               <w:t>The second part of the inscription is an elegiac couplet poem (1693) featuring Marian allegories (Domus Aurea, Turris David) celebrating the connection between Bologna (Felsina) and the Sanctuary of the Guardia.</w:t>
             </w:r>
           </w:p>
         </w:tc>
         <w:tc>
           <w:tcPr>
-            <w:tcW w:type="dxa" w:w="4680"/>
+            <w:tcW w:w="4680" w:type="dxa"/>
           </w:tcPr>
           <w:p>
             <w:r>
               <w:rPr>
-                <w:rFonts w:ascii="Arial" w:hAnsi="Arial"/>
                 <w:sz w:val="19"/>
               </w:rPr>
               <w:t>Epigraphic and Literary Analysis of the Portico di San Luca</w:t>
@@ -7158,6 +7183,7 @@
         </w:tc>
       </w:tr>
     </w:tbl>
+    <w:p/>
     <w:sectPr>
       <w:pgSz w:w="12240" w:h="15840"/>
       <w:pgMar w:top="1440" w:right="1440" w:bottom="1440" w:left="1440" w:header="0" w:footer="720" w:gutter="0"/>

</xml_diff>